<commit_message>
Revert link underlines to hover-only, matching the nav pattern
Gilbert's call, made with the tradeoff understood: WAVE reported zero
errors on every page and an AIM score of 10/10 site-wide, but
Lighthouse's stricter axe ruleset flagged in-text links as relying on
colour alone (WCAG 1.4.1), since the previous commit made underline
the default. Underlining every in-text link site-wide, given how
link-dense the topic pages are by design, hurt readability more than
the finding was worth. Reverted to the same colour-plus-hover pattern
the primary nav already used successfully, dropping Lighthouse
accessibility back to ~95 on prose-heavy pages as a known, deliberate
tradeoff rather than an unaddressed defect. The settings-panel toggle
still offers underlined links as an opt-in.

Documented the reasoning in docs/course-log.md for the Project 4
reflection.
</commit_message>
<xml_diff>
--- a/docs/upload/WDDE385-Course-Log-Anderson.docx
+++ b/docs/upload/WDDE385-Course-Log-Anderson.docx
@@ -288,6 +288,59 @@
           <w:i w:val="0"/>
         </w:rPr>
         <w:t>This feeds Reflection Question 1, and anything about documentation practice, version control, or quality assurance.</w:t>
+      </w:r>
+    </w:p>
+    <w:p>
+      <w:pPr>
+        <w:pStyle w:val="Heading2"/>
+      </w:pPr>
+      <w:r>
+        <w:t>2026-08-24: Two tools, two different answers on the same link</w:t>
+      </w:r>
+    </w:p>
+    <w:p>
+      <w:r>
+        <w:rPr>
+          <w:b w:val="0"/>
+          <w:i w:val="0"/>
+        </w:rPr>
+        <w:t>Running the site through WAVE and Lighthouse for Project 4 turned up a real disagreement between the tools rather than a clean pass or fail, and I want to record how I resolved it because the resolution came down to my own judgment call, not a tool's verdict.</w:t>
+      </w:r>
+    </w:p>
+    <w:p>
+      <w:r>
+        <w:rPr>
+          <w:b w:val="0"/>
+          <w:i w:val="0"/>
+        </w:rPr>
+        <w:t>WAVE reported zero errors and zero contrast errors on every page, with an AIM score of 10 out of 10 across the board. Lighthouse's accessibility audit, which runs axe under the hood, was stricter: it flagged in-text links as relying on colour alone to be distinguishable from the surrounding paragraph, since the site's default styling underlined links only on hover, the same way the primary navigation already behaved. That single finding was enough to drop the Lighthouse accessibility score from 100 to 95 on pages with prose links in them.</w:t>
+      </w:r>
+    </w:p>
+    <w:p>
+      <w:r>
+        <w:rPr>
+          <w:b w:val="0"/>
+          <w:i w:val="0"/>
+        </w:rPr>
+        <w:t>My first fix was to make every link underlined by default site-wide, which cleared the finding and brought every page back to 100. I did not sit with that decision, and once I looked at a real page with it applied, I did not like it. This site's whole design is dense with in-text links, since every topic page cross-links related concepts constantly, and a paragraph with five or six underlined phrases in it is genuinely harder to read than one where the links are distinguished by colour and by a hover state, the same convention the navigation already used successfully.</w:t>
+      </w:r>
+    </w:p>
+    <w:p>
+      <w:r>
+        <w:rPr>
+          <w:b w:val="0"/>
+          <w:i w:val="0"/>
+        </w:rPr>
+        <w:t>So I reverted the default back to colour-plus-hover-underline, the same pattern the nav uses, and accepted the Lighthouse finding as a known, deliberate tradeoff rather than an unaddressed defect. The settings panel still offers underlined links as an opt-in for anyone who wants or needs that stronger cue, which is the same principle Section 10 of the proposal describes: customization supplements the default instead of the default being weakened to avoid ever needing customization. I am comfortable defending this specific choice because WAVE, the tool the assignment specifically names, did not flag it at all, and Lighthouse's own rule is phrased as identifying links that rely on colour ALONE, which is not quite true here once hover and focus states are counted.</w:t>
+      </w:r>
+    </w:p>
+    <w:p>
+      <w:r>
+        <w:rPr>
+          <w:b w:val="0"/>
+          <w:i w:val="0"/>
+        </w:rPr>
+        <w:t>This feeds the Project 4 reflection, specifically the question about issues the tools identified and how I addressed them, since "addressed" here means "evaluated and made a deliberate call," not only "silenced the finding."</w:t>
       </w:r>
     </w:p>
     <w:sectPr>

</xml_diff>